<commit_message>
Adicionei funcionalidades à aplicação da mesa e reorganizei o código em ficheiros
</commit_message>
<xml_diff>
--- a/doc/ProductRequest.docx
+++ b/doc/ProductRequest.docx
@@ -139,7 +139,49 @@
     </w:p>
     <w:p>
       <w:r>
-        <w:t>O “Real time/Real feel Basquetebol” é um site e aplicação para a mesa de jogo e para os adeptos. O objetivo é oferecer um boletim de jogo digital simples, rápido e que não vá abaixo, inspirado no sistema do andebol. Assim, qualquer pessoa pode acompanhar o resultado no telemóvel ao mesmo tempo que o jogo acontece, sem atrasos.</w:t>
+        <w:t>O “Real time/Real feel Basquetebol” é um</w:t>
+      </w:r>
+      <w:r>
+        <w:t xml:space="preserve">a aplicação web </w:t>
+      </w:r>
+      <w:r>
+        <w:t xml:space="preserve">e </w:t>
+      </w:r>
+      <w:r>
+        <w:t>móvel</w:t>
+      </w:r>
+      <w:r>
+        <w:t xml:space="preserve"> para a mesa de jogo e para os adeptos. O objetivo é oferecer um boletim de jogo digital simples</w:t>
+      </w:r>
+      <w:r>
+        <w:t xml:space="preserve"> e</w:t>
+      </w:r>
+      <w:r>
+        <w:t xml:space="preserve"> rápido</w:t>
+      </w:r>
+      <w:r>
+        <w:t>,</w:t>
+      </w:r>
+      <w:r>
+        <w:t xml:space="preserve"> inspirado no sistema </w:t>
+      </w:r>
+      <w:r>
+        <w:t>utilizado n</w:t>
+      </w:r>
+      <w:r>
+        <w:t xml:space="preserve">o andebol. </w:t>
+      </w:r>
+      <w:r>
+        <w:t>Desta forma</w:t>
+      </w:r>
+      <w:r>
+        <w:t>, qualquer pessoa pode acompanhar o resultado no telemóvel ao mesmo tempo que o jogo acontece, sem atrasos</w:t>
+      </w:r>
+      <w:r>
+        <w:t xml:space="preserve"> significativos</w:t>
+      </w:r>
+      <w:r>
+        <w:t>.</w:t>
       </w:r>
     </w:p>
     <w:p/>
@@ -160,45 +202,220 @@
       </w:r>
     </w:p>
     <w:p>
-      <w:r>
-        <w:t xml:space="preserve">Problema: A Federeção de Basquetebol já usa aplicações, como a INGAME, em muitos jogos. No entanto, o preenchimento em papel ainda acontece nos escalões mais jovens (como o Mini-Basquete) ou quando os tables e a internet falham. Além disso, quero criar uma alternativa portuguesa mais simples e acessível, baseada no modelo que já funciona muito bem no Andebol. </w:t>
+      <w:pPr>
+        <w:pStyle w:val="ListParagraph"/>
+        <w:numPr>
+          <w:ilvl w:val="0"/>
+          <w:numId w:val="4"/>
+        </w:numPr>
+      </w:pPr>
+      <w:r>
+        <w:rPr>
+          <w:b/>
+          <w:bCs/>
+        </w:rPr>
+        <w:t>Problema:</w:t>
+      </w:r>
+      <w:r>
+        <w:t xml:space="preserve"> A Feder</w:t>
+      </w:r>
+      <w:r>
+        <w:t>a</w:t>
+      </w:r>
+      <w:r>
+        <w:t>ção</w:t>
+      </w:r>
+      <w:r>
+        <w:t xml:space="preserve"> Portuguesa</w:t>
+      </w:r>
+      <w:r>
+        <w:t xml:space="preserve"> de Basquetebol já usa aplicações, como a INGAME, em muitos jogos. No entanto, o preenchimento em papel ainda acontece nos escalões mais jovens (como o Mini-Basquete) ou quando os </w:t>
+      </w:r>
+      <w:r>
+        <w:t>equipamentos</w:t>
+      </w:r>
+      <w:r>
+        <w:t xml:space="preserve"> e a</w:t>
+      </w:r>
+      <w:r>
+        <w:t xml:space="preserve"> ligação à</w:t>
+      </w:r>
+      <w:r>
+        <w:t xml:space="preserve"> internet falham. </w:t>
+      </w:r>
+      <w:r>
+        <w:t>Com isto, pretendo</w:t>
+      </w:r>
+      <w:r>
+        <w:t xml:space="preserve"> criar uma alternativa </w:t>
+      </w:r>
+      <w:r>
+        <w:t>nacional</w:t>
+      </w:r>
+      <w:r>
+        <w:t xml:space="preserve"> mais simples e acessível, baseada no modelo que já funciona muito bem no Andebol. </w:t>
       </w:r>
     </w:p>
     <w:p/>
     <w:p>
-      <w:r>
-        <w:t>Utilzadores:</w:t>
+      <w:pPr>
+        <w:pStyle w:val="ListParagraph"/>
+        <w:numPr>
+          <w:ilvl w:val="0"/>
+          <w:numId w:val="4"/>
+        </w:numPr>
+        <w:rPr>
+          <w:b/>
+          <w:bCs/>
+        </w:rPr>
+      </w:pPr>
+      <w:r>
+        <w:rPr>
+          <w:b/>
+          <w:bCs/>
+        </w:rPr>
+        <w:t>Util</w:t>
+      </w:r>
+      <w:r>
+        <w:rPr>
+          <w:b/>
+          <w:bCs/>
+        </w:rPr>
+        <w:t>i</w:t>
+      </w:r>
+      <w:r>
+        <w:rPr>
+          <w:b/>
+          <w:bCs/>
+        </w:rPr>
+        <w:t>zadores:</w:t>
+      </w:r>
+    </w:p>
+    <w:p>
+      <w:pPr>
+        <w:pStyle w:val="ListParagraph"/>
+        <w:numPr>
+          <w:ilvl w:val="1"/>
+          <w:numId w:val="4"/>
+        </w:numPr>
+      </w:pPr>
+      <w:r>
+        <w:rPr>
+          <w:b/>
+          <w:bCs/>
+        </w:rPr>
+        <w:t>Mesa de jogo:</w:t>
+      </w:r>
+      <w:r>
+        <w:t xml:space="preserve"> </w:t>
+      </w:r>
+      <w:r>
+        <w:t>Elementos</w:t>
+      </w:r>
+      <w:r>
+        <w:t xml:space="preserve"> que registam os pontos</w:t>
+      </w:r>
+      <w:r>
+        <w:t xml:space="preserve">, </w:t>
+      </w:r>
+      <w:r>
+        <w:t>faltas</w:t>
+      </w:r>
+      <w:r>
+        <w:t xml:space="preserve"> e ocorrências</w:t>
+      </w:r>
+      <w:r>
+        <w:t xml:space="preserve"> no pavilhão.</w:t>
+      </w:r>
+    </w:p>
+    <w:p>
+      <w:pPr>
+        <w:pStyle w:val="ListParagraph"/>
+        <w:numPr>
+          <w:ilvl w:val="1"/>
+          <w:numId w:val="4"/>
+        </w:numPr>
+      </w:pPr>
+      <w:r>
+        <w:rPr>
+          <w:b/>
+          <w:bCs/>
+        </w:rPr>
+        <w:t>Adeptos:</w:t>
+      </w:r>
+      <w:r>
+        <w:t xml:space="preserve"> </w:t>
+      </w:r>
+      <w:r>
+        <w:t>Espectadores</w:t>
+      </w:r>
+      <w:r>
+        <w:t xml:space="preserve"> </w:t>
+      </w:r>
+      <w:r>
+        <w:t>que desejam acompanhar</w:t>
+      </w:r>
+      <w:r>
+        <w:t xml:space="preserve"> o jogo em direto </w:t>
+      </w:r>
+      <w:r>
+        <w:t>através do</w:t>
+      </w:r>
+      <w:r>
+        <w:t xml:space="preserve"> telemóvel ou computador.</w:t>
+      </w:r>
+    </w:p>
+    <w:p>
+      <w:pPr>
+        <w:pStyle w:val="ListParagraph"/>
+        <w:numPr>
+          <w:ilvl w:val="1"/>
+          <w:numId w:val="4"/>
+        </w:numPr>
+      </w:pPr>
+      <w:r>
+        <w:rPr>
+          <w:b/>
+          <w:bCs/>
+        </w:rPr>
+        <w:t xml:space="preserve">Outros interessados: </w:t>
+      </w:r>
+      <w:r>
+        <w:t>A Feder</w:t>
+      </w:r>
+      <w:r>
+        <w:t>a</w:t>
+      </w:r>
+      <w:r>
+        <w:t xml:space="preserve">ção </w:t>
+      </w:r>
+      <w:r>
+        <w:t xml:space="preserve">de Basquetebol </w:t>
+      </w:r>
+      <w:r>
+        <w:t>e os Clubes</w:t>
+      </w:r>
+      <w:r>
+        <w:t xml:space="preserve"> desportivos</w:t>
+      </w:r>
+      <w:r>
+        <w:t xml:space="preserve"> (sobretudo nos escalões de formação).</w:t>
       </w:r>
     </w:p>
     <w:p>
       <w:r>
         <w:tab/>
-        <w:t>Mesa de jogo: as pessoas que registam os pontos e faltas no pavilhão.</w:t>
-      </w:r>
-    </w:p>
-    <w:p>
-      <w:r>
-        <w:tab/>
-        <w:t>Adeptos: quem quer ver o jogo em direto no telemóvel ou computador.</w:t>
-      </w:r>
-    </w:p>
-    <w:p>
-      <w:r>
-        <w:t>Outros interessados: A Federeção e os Clubes (sobretudo nos escalões de formação).</w:t>
-      </w:r>
-    </w:p>
-    <w:p>
-      <w:r>
-        <w:tab/>
       </w:r>
     </w:p>
     <w:p/>
-    <w:p>
-      <w:r>
-        <w:rPr>
-          <w:b/>
-          <w:bCs/>
-        </w:rPr>
+    <w:p/>
+    <w:p>
+      <w:r>
+        <w:rPr>
+          <w:b/>
+          <w:bCs/>
+        </w:rPr>
+        <w:lastRenderedPageBreak/>
         <w:t xml:space="preserve">3. </w:t>
       </w:r>
       <w:r>
@@ -210,21 +427,121 @@
       </w:r>
     </w:p>
     <w:p>
-      <w:r>
-        <w:t>Objetivo: Mostrar no ecrã dos adeptos tudo o que acontece no jogo (pontos e faltas) em menos de 3 segundos após o registo na mesa.</w:t>
+      <w:pPr>
+        <w:pStyle w:val="ListParagraph"/>
+        <w:numPr>
+          <w:ilvl w:val="0"/>
+          <w:numId w:val="5"/>
+        </w:numPr>
+      </w:pPr>
+      <w:r>
+        <w:rPr>
+          <w:b/>
+          <w:bCs/>
+        </w:rPr>
+        <w:t>Objetivo:</w:t>
+      </w:r>
+      <w:r>
+        <w:t xml:space="preserve"> Mostrar no ecrã dos adeptos tudo o que acontece no jogo (pontos e faltas) em menos de 3 segundos após o registo </w:t>
+      </w:r>
+      <w:r>
+        <w:t xml:space="preserve">efetuado </w:t>
+      </w:r>
+      <w:r>
+        <w:t>na mesa.</w:t>
       </w:r>
     </w:p>
     <w:p/>
     <w:p>
-      <w:r>
-        <w:lastRenderedPageBreak/>
-        <w:t>Como confirmar: Fazer um teste prático com um telemóvel e um computador para medir o tempo exato entre a marcação de um ponto na mesa e a sua localização na página pública.</w:t>
+      <w:pPr>
+        <w:pStyle w:val="ListParagraph"/>
+        <w:numPr>
+          <w:ilvl w:val="0"/>
+          <w:numId w:val="5"/>
+        </w:numPr>
+      </w:pPr>
+      <w:r>
+        <w:rPr>
+          <w:b/>
+          <w:bCs/>
+        </w:rPr>
+        <w:t>Como confirmar:</w:t>
+      </w:r>
+      <w:r>
+        <w:t xml:space="preserve"> Fazer um teste prático </w:t>
+      </w:r>
+      <w:r>
+        <w:t>utilizando</w:t>
+      </w:r>
+      <w:r>
+        <w:t xml:space="preserve"> um telemóvel e um computador para medir o tempo exato entre a marcação de um ponto na </w:t>
+      </w:r>
+      <w:r>
+        <w:t xml:space="preserve">interface da </w:t>
+      </w:r>
+      <w:r>
+        <w:t xml:space="preserve">mesa e a sua </w:t>
+      </w:r>
+      <w:r>
+        <w:t>atualização</w:t>
+      </w:r>
+      <w:r>
+        <w:t xml:space="preserve"> na página pública.</w:t>
       </w:r>
     </w:p>
     <w:p/>
     <w:p>
-      <w:r>
-        <w:t>Benificio: …</w:t>
+      <w:pPr>
+        <w:pStyle w:val="ListParagraph"/>
+        <w:numPr>
+          <w:ilvl w:val="0"/>
+          <w:numId w:val="5"/>
+        </w:numPr>
+      </w:pPr>
+      <w:r>
+        <w:rPr>
+          <w:b/>
+          <w:bCs/>
+        </w:rPr>
+        <w:t>Ben</w:t>
+      </w:r>
+      <w:r>
+        <w:rPr>
+          <w:b/>
+          <w:bCs/>
+        </w:rPr>
+        <w:t>e</w:t>
+      </w:r>
+      <w:r>
+        <w:rPr>
+          <w:b/>
+          <w:bCs/>
+        </w:rPr>
+        <w:t>f</w:t>
+      </w:r>
+      <w:r>
+        <w:rPr>
+          <w:b/>
+          <w:bCs/>
+        </w:rPr>
+        <w:t>í</w:t>
+      </w:r>
+      <w:r>
+        <w:rPr>
+          <w:b/>
+          <w:bCs/>
+        </w:rPr>
+        <w:t>cio</w:t>
+      </w:r>
+      <w:r>
+        <w:rPr>
+          <w:b/>
+          <w:bCs/>
+        </w:rPr>
+        <w:t>:</w:t>
+      </w:r>
+      <w:r>
+        <w:t xml:space="preserve"> Dar aos adeptos resultados em direto sem atrasos e poupar tempo à mesa de jogo, substituindo o papel por um registo digital rápido.</w:t>
       </w:r>
     </w:p>
     <w:p/>
@@ -260,7 +577,13 @@
         <w:t xml:space="preserve">Acesso da mesa: </w:t>
       </w:r>
       <w:r>
-        <w:t>Um sistema de credenciais para garantir que apenas as pessoas autorizadas (oficiais de mesa) podem mexer no resultado oficial.</w:t>
+        <w:t xml:space="preserve">Um sistema de </w:t>
+      </w:r>
+      <w:r>
+        <w:t xml:space="preserve">autenticação por </w:t>
+      </w:r>
+      <w:r>
+        <w:t>credenciais para garantir que apenas as pessoas autorizadas (oficiais de mesa) podem mexer no resultado oficial.</w:t>
       </w:r>
     </w:p>
     <w:p>
@@ -304,7 +627,19 @@
         <w:t>Resultado em direto:</w:t>
       </w:r>
       <w:r>
-        <w:t xml:space="preserve"> Uma página pública na internet onde os adeptos podem ver o resultado e o tempo de jogo a atualizarem sozinhos.</w:t>
+        <w:t xml:space="preserve"> Uma página pública na internet onde os adeptos podem ver o resultado e o tempo de jogo a atualizarem </w:t>
+      </w:r>
+      <w:r>
+        <w:t>autom</w:t>
+      </w:r>
+      <w:r>
+        <w:t>a</w:t>
+      </w:r>
+      <w:r>
+        <w:t>ticamente</w:t>
+      </w:r>
+      <w:r>
+        <w:t>.</w:t>
       </w:r>
     </w:p>
     <w:p>
@@ -333,7 +668,13 @@
         <w:t>Boletim final:</w:t>
       </w:r>
       <w:r>
-        <w:t xml:space="preserve"> Quando o jogo termina, o sistema cria logo o documento final em formato </w:t>
+        <w:t xml:space="preserve"> Quando o jogo termina, o sistema </w:t>
+      </w:r>
+      <w:r>
+        <w:t>gera</w:t>
+      </w:r>
+      <w:r>
+        <w:t xml:space="preserve"> logo o documento final em formato </w:t>
       </w:r>
       <w:r>
         <w:t>digital (PDF) com tudo o que aconteceu.</w:t>
@@ -342,96 +683,325 @@
     <w:p>
       <w:r>
         <w:t xml:space="preserve"> </w:t>
-      </w:r>
-    </w:p>
-    <w:p>
-      <w:r>
-        <w:rPr>
-          <w:b/>
-          <w:bCs/>
-        </w:rPr>
-        <w:t xml:space="preserve">5. </w:t>
-      </w:r>
-      <w:r>
-        <w:rPr>
-          <w:b/>
-          <w:bCs/>
-        </w:rPr>
-        <w:t>Âmbito inicial</w:t>
-      </w:r>
-    </w:p>
-    <w:p>
-      <w:r>
-        <w:t>O que fica incluído: O login seguro para a mesa, o ecrã para registar o jogo, a página em direto para os adeptos e a criação do boletim no final.</w:t>
-      </w:r>
-    </w:p>
-    <w:p/>
-    <w:p>
-      <w:r>
-        <w:t>O que fica de fora:</w:t>
-      </w:r>
-    </w:p>
-    <w:p>
-      <w:r>
-        <w:tab/>
-        <w:t>O sistema não vai funcionar sem internet: A criação de um modo “offline” fica para o futuro. Se a internet for abaixo, o sistema para de enviar dados.</w:t>
-      </w:r>
-    </w:p>
-    <w:p>
-      <w:r>
-        <w:tab/>
-        <w:t>Sem ligação automática: O sistema não estará ligado à base de dados da Federação, logo, os nomes de jogadores e das equipas terão de ser inseridos à mão nesta primeira fase.</w:t>
       </w:r>
     </w:p>
     <w:p/>
     <w:p/>
-    <w:p>
-      <w:r>
-        <w:lastRenderedPageBreak/>
-        <w:t xml:space="preserve"> </w:t>
-      </w:r>
-    </w:p>
-    <w:p>
-      <w:r>
-        <w:rPr>
-          <w:b/>
-          <w:bCs/>
-        </w:rPr>
-        <w:t xml:space="preserve">6. </w:t>
-      </w:r>
-      <w:r>
-        <w:rPr>
-          <w:b/>
-          <w:bCs/>
-        </w:rPr>
-        <w:t>Pressupostos e questões em aberto</w:t>
-      </w:r>
-    </w:p>
-    <w:p/>
-    <w:p>
-      <w:r>
-        <w:t>O que assumo como certo: O pavilhão do jogo tem de ter obrigatoriamente ligação à internet (Wi-Fi ou dados móveis) para a aplicação funcionar e enviar dados para os adeptos.</w:t>
-      </w:r>
-    </w:p>
-    <w:p>
-      <w:r>
-        <w:t>O que falta confirmar:</w:t>
-      </w:r>
-    </w:p>
-    <w:p>
-      <w:r>
-        <w:tab/>
-        <w:t>Como organizar os botões no ecrã para que a pessoa da mesa consiga ser mais rápida a carregar do que a escrever com uma caneta de papel?</w:t>
-      </w:r>
-    </w:p>
-    <w:p>
-      <w:r>
-        <w:tab/>
-        <w:t>Será que as Associações e a Federação aceitam o boletim gerado por este sistema como documento oficial num cenário que a aplicação deles (INGAME) falhe?</w:t>
-      </w:r>
-    </w:p>
     <w:p/>
     <w:p/>
+    <w:p/>
+    <w:p/>
+    <w:p>
+      <w:r>
+        <w:rPr>
+          <w:b/>
+          <w:bCs/>
+        </w:rPr>
+        <w:lastRenderedPageBreak/>
+        <w:t xml:space="preserve">5. </w:t>
+      </w:r>
+      <w:r>
+        <w:rPr>
+          <w:b/>
+          <w:bCs/>
+        </w:rPr>
+        <w:t>Âmbito inicial</w:t>
+      </w:r>
+    </w:p>
+    <w:p>
+      <w:pPr>
+        <w:pStyle w:val="ListParagraph"/>
+        <w:numPr>
+          <w:ilvl w:val="0"/>
+          <w:numId w:val="2"/>
+        </w:numPr>
+      </w:pPr>
+      <w:r>
+        <w:rPr>
+          <w:b/>
+          <w:bCs/>
+        </w:rPr>
+        <w:t xml:space="preserve">O </w:t>
+      </w:r>
+      <w:r>
+        <w:rPr>
+          <w:b/>
+          <w:bCs/>
+        </w:rPr>
+        <w:t>que fica incluído:</w:t>
+      </w:r>
+      <w:r>
+        <w:t xml:space="preserve"> O </w:t>
+      </w:r>
+      <w:r>
+        <w:t>início de sessão</w:t>
+      </w:r>
+      <w:r>
+        <w:t xml:space="preserve"> seguro para a mesa,  </w:t>
+      </w:r>
+      <w:r>
+        <w:t>a interface</w:t>
+      </w:r>
+      <w:r>
+        <w:t xml:space="preserve"> para registar o jogo, a página </w:t>
+      </w:r>
+      <w:r>
+        <w:t xml:space="preserve">pública </w:t>
+      </w:r>
+      <w:r>
+        <w:t>em direto para os adeptos e a criação do boletim no final.</w:t>
+      </w:r>
+    </w:p>
+    <w:p/>
+    <w:p>
+      <w:pPr>
+        <w:pStyle w:val="ListParagraph"/>
+        <w:numPr>
+          <w:ilvl w:val="0"/>
+          <w:numId w:val="2"/>
+        </w:numPr>
+        <w:rPr>
+          <w:b/>
+          <w:bCs/>
+        </w:rPr>
+      </w:pPr>
+      <w:r>
+        <w:rPr>
+          <w:b/>
+          <w:bCs/>
+        </w:rPr>
+        <w:t xml:space="preserve">O </w:t>
+      </w:r>
+      <w:r>
+        <w:rPr>
+          <w:b/>
+          <w:bCs/>
+        </w:rPr>
+        <w:t>que fica de fora:</w:t>
+      </w:r>
+    </w:p>
+    <w:p>
+      <w:pPr>
+        <w:pStyle w:val="ListParagraph"/>
+        <w:numPr>
+          <w:ilvl w:val="1"/>
+          <w:numId w:val="2"/>
+        </w:numPr>
+      </w:pPr>
+      <w:r>
+        <w:rPr>
+          <w:b/>
+          <w:bCs/>
+        </w:rPr>
+        <w:t xml:space="preserve">O </w:t>
+      </w:r>
+      <w:r>
+        <w:rPr>
+          <w:b/>
+          <w:bCs/>
+        </w:rPr>
+        <w:t xml:space="preserve">sistema não vai funcionar sem internet: </w:t>
+      </w:r>
+      <w:r>
+        <w:t>A</w:t>
+      </w:r>
+      <w:r>
+        <w:t xml:space="preserve"> criação de um modo “offline” fica para o futuro. Se a </w:t>
+      </w:r>
+      <w:r>
+        <w:t xml:space="preserve">ligação à </w:t>
+      </w:r>
+      <w:r>
+        <w:t>internet for abaixo, o sistema para de enviar dados</w:t>
+      </w:r>
+      <w:r>
+        <w:t xml:space="preserve"> temporariamente</w:t>
+      </w:r>
+      <w:r>
+        <w:t>.</w:t>
+      </w:r>
+    </w:p>
+    <w:p>
+      <w:pPr>
+        <w:pStyle w:val="ListParagraph"/>
+        <w:ind w:left="1440"/>
+      </w:pPr>
+      <w:r>
+        <w:t xml:space="preserve"> </w:t>
+      </w:r>
+    </w:p>
+    <w:p>
+      <w:pPr>
+        <w:pStyle w:val="ListParagraph"/>
+        <w:numPr>
+          <w:ilvl w:val="1"/>
+          <w:numId w:val="2"/>
+        </w:numPr>
+      </w:pPr>
+      <w:r>
+        <w:rPr>
+          <w:b/>
+          <w:bCs/>
+        </w:rPr>
+        <w:t xml:space="preserve">Integração </w:t>
+      </w:r>
+      <w:r>
+        <w:rPr>
+          <w:b/>
+          <w:bCs/>
+        </w:rPr>
+        <w:t>automática:</w:t>
+      </w:r>
+      <w:r>
+        <w:t xml:space="preserve"> O sistema não estará ligado à base de dados </w:t>
+      </w:r>
+      <w:r>
+        <w:t xml:space="preserve">oficial </w:t>
+      </w:r>
+      <w:r>
+        <w:t xml:space="preserve">da Federação, logo, os nomes de jogadores e das equipas terão de ser inseridos </w:t>
+      </w:r>
+      <w:r>
+        <w:t xml:space="preserve">manualmente </w:t>
+      </w:r>
+      <w:r>
+        <w:t>nesta primeira fase.</w:t>
+      </w:r>
+    </w:p>
+    <w:p/>
+    <w:p>
+      <w:r>
+        <w:rPr>
+          <w:b/>
+          <w:bCs/>
+        </w:rPr>
+        <w:t xml:space="preserve">6. </w:t>
+      </w:r>
+      <w:r>
+        <w:rPr>
+          <w:b/>
+          <w:bCs/>
+        </w:rPr>
+        <w:t>Pressupostos e questões em aberto</w:t>
+      </w:r>
+    </w:p>
+    <w:p>
+      <w:pPr>
+        <w:pStyle w:val="ListParagraph"/>
+        <w:numPr>
+          <w:ilvl w:val="0"/>
+          <w:numId w:val="8"/>
+        </w:numPr>
+      </w:pPr>
+      <w:r>
+        <w:rPr>
+          <w:b/>
+          <w:bCs/>
+        </w:rPr>
+        <w:t>Pressupostos</w:t>
+      </w:r>
+      <w:r>
+        <w:rPr>
+          <w:b/>
+          <w:bCs/>
+        </w:rPr>
+        <w:t xml:space="preserve">: </w:t>
+      </w:r>
+      <w:r>
+        <w:t xml:space="preserve">O pavilhão </w:t>
+      </w:r>
+      <w:r>
+        <w:t xml:space="preserve">onde o </w:t>
+      </w:r>
+      <w:r>
+        <w:t>jogo</w:t>
+      </w:r>
+      <w:r>
+        <w:t xml:space="preserve"> decorre</w:t>
+      </w:r>
+      <w:r>
+        <w:t xml:space="preserve"> tem de ter obrigatoriamente ligação à internet (Wi-Fi ou dados móveis) para a aplicação funcionar e enviar dados </w:t>
+      </w:r>
+      <w:r>
+        <w:t xml:space="preserve">em tempo real </w:t>
+      </w:r>
+      <w:r>
+        <w:t>para os adeptos.</w:t>
+      </w:r>
+    </w:p>
+    <w:p>
+      <w:pPr>
+        <w:pStyle w:val="ListParagraph"/>
+      </w:pPr>
+    </w:p>
+    <w:p>
+      <w:pPr>
+        <w:pStyle w:val="ListParagraph"/>
+        <w:numPr>
+          <w:ilvl w:val="0"/>
+          <w:numId w:val="2"/>
+        </w:numPr>
+        <w:rPr>
+          <w:b/>
+          <w:bCs/>
+        </w:rPr>
+      </w:pPr>
+      <w:r>
+        <w:rPr>
+          <w:b/>
+          <w:bCs/>
+        </w:rPr>
+        <w:t xml:space="preserve">O </w:t>
+      </w:r>
+      <w:r>
+        <w:rPr>
+          <w:b/>
+          <w:bCs/>
+        </w:rPr>
+        <w:t>que falta confirmar:</w:t>
+      </w:r>
+    </w:p>
+    <w:p>
+      <w:pPr>
+        <w:pStyle w:val="ListParagraph"/>
+        <w:rPr>
+          <w:b/>
+          <w:bCs/>
+        </w:rPr>
+      </w:pPr>
+    </w:p>
+    <w:p>
+      <w:pPr>
+        <w:pStyle w:val="ListParagraph"/>
+        <w:numPr>
+          <w:ilvl w:val="1"/>
+          <w:numId w:val="2"/>
+        </w:numPr>
+      </w:pPr>
+      <w:r>
+        <w:t xml:space="preserve">Como estruturar e </w:t>
+      </w:r>
+      <w:r>
+        <w:t>organizar os botões no ecrã para que a pessoa da mesa consiga ser mais rápida a carregar do que a escrever com uma caneta de papel?</w:t>
+      </w:r>
+    </w:p>
+    <w:p>
+      <w:r>
+        <w:tab/>
+      </w:r>
+    </w:p>
+    <w:p>
+      <w:pPr>
+        <w:pStyle w:val="ListParagraph"/>
+        <w:numPr>
+          <w:ilvl w:val="1"/>
+          <w:numId w:val="2"/>
+        </w:numPr>
+      </w:pPr>
+      <w:r>
+        <w:t>Será que as Associações e a Federação aceitam o boletim gerado por este sistema como documento oficial num cenário que a aplicação deles (INGAME) falhe?</w:t>
+      </w:r>
+    </w:p>
     <w:p/>
     <w:p/>
     <w:p/>
@@ -677,6 +1247,607 @@
 <file path=word/numbering.xml><?xml version="1.0" encoding="utf-8"?>
 <w:numbering xmlns:wpc="http://schemas.microsoft.com/office/word/2010/wordprocessingCanvas" xmlns:cx="http://schemas.microsoft.com/office/drawing/2014/chartex" xmlns:cx1="http://schemas.microsoft.com/office/drawing/2015/9/8/chartex" xmlns:cx2="http://schemas.microsoft.com/office/drawing/2015/10/21/chartex" xmlns:cx3="http://schemas.microsoft.com/office/drawing/2016/5/9/chartex" xmlns:cx4="http://schemas.microsoft.com/office/drawing/2016/5/10/chartex" xmlns:cx5="http://schemas.microsoft.com/office/drawing/2016/5/11/chartex" xmlns:cx6="http://schemas.microsoft.com/office/drawing/2016/5/12/chartex" xmlns:cx7="http://schemas.microsoft.com/office/drawing/2016/5/13/chartex" xmlns:cx8="http://schemas.microsoft.com/office/drawing/2016/5/14/chartex" xmlns:mc="http://schemas.openxmlformats.org/markup-compatibility/2006" xmlns:m="http://schemas.openxmlformats.org/officeDocument/2006/math" xmlns:aink="http://schemas.microsoft.com/office/drawing/2016/ink" xmlns:am3d="http://schemas.microsoft.com/office/drawing/2017/model3d" xmlns:oel="http://schemas.microsoft.com/office/2019/extlst" xmlns:r="http://schemas.openxmlformats.org/officeDocument/2006/relationships" xmlns:wp14="http://schemas.microsoft.com/office/word/2010/wordprocessingDrawing" xmlns:wp="http://schemas.openxmlformats.org/drawingml/2006/wordprocessingDrawing" xmlns:wpg="http://schemas.microsoft.com/office/word/2010/wordprocessingGroup" xmlns:wpi="http://schemas.microsoft.com/office/word/2010/wordprocessingInk" xmlns:wps="http://schemas.microsoft.com/office/word/2010/wordprocessingShape" xmlns:o="urn:schemas-microsoft-com:office:office" xmlns:v="urn:schemas-microsoft-com:vml" xmlns:w10="urn:schemas-microsoft-com:office:word" xmlns:w="http://schemas.openxmlformats.org/wordprocessingml/2006/main" xmlns:w14="http://schemas.microsoft.com/office/word/2010/wordml" xmlns:w15="http://schemas.microsoft.com/office/word/2012/wordml" xmlns:w16cex="http://schemas.microsoft.com/office/word/2018/wordml/cex" xmlns:w16cid="http://schemas.microsoft.com/office/word/2016/wordml/cid" xmlns:w16="http://schemas.microsoft.com/office/word/2018/wordml" xmlns:w16sdtdh="http://schemas.microsoft.com/office/word/2020/wordml/sdtdatahash" xmlns:w16sdtfl="http://schemas.microsoft.com/office/word/2024/wordml/sdtformatlock" xmlns:w16se="http://schemas.microsoft.com/office/word/2015/wordml/symex" xmlns:w16du="http://schemas.microsoft.com/office/word/2023/wordml/word16du" xmlns:wne="http://schemas.microsoft.com/office/word/2006/wordml" mc:Ignorable="w14 w15 w16se w16cid w16 w16cex w16sdtdh w16sdtfl w16du wp14">
   <w:abstractNum w:abstractNumId="0" w15:restartNumberingAfterBreak="0">
+    <w:nsid w:val="020C3D4A"/>
+    <w:multiLevelType w:val="hybridMultilevel"/>
+    <w:tmpl w:val="DD685B72"/>
+    <w:lvl w:ilvl="0" w:tplc="08090001">
+      <w:start w:val="1"/>
+      <w:numFmt w:val="bullet"/>
+      <w:lvlText w:val=""/>
+      <w:lvlJc w:val="left"/>
+      <w:pPr>
+        <w:ind w:left="720" w:hanging="360"/>
+      </w:pPr>
+      <w:rPr>
+        <w:rFonts w:ascii="Symbol" w:hAnsi="Symbol" w:hint="default"/>
+      </w:rPr>
+    </w:lvl>
+    <w:lvl w:ilvl="1" w:tplc="08090003" w:tentative="1">
+      <w:start w:val="1"/>
+      <w:numFmt w:val="bullet"/>
+      <w:lvlText w:val="o"/>
+      <w:lvlJc w:val="left"/>
+      <w:pPr>
+        <w:ind w:left="1440" w:hanging="360"/>
+      </w:pPr>
+      <w:rPr>
+        <w:rFonts w:ascii="Courier New" w:hAnsi="Courier New" w:cs="Courier New" w:hint="default"/>
+      </w:rPr>
+    </w:lvl>
+    <w:lvl w:ilvl="2" w:tplc="08090005" w:tentative="1">
+      <w:start w:val="1"/>
+      <w:numFmt w:val="bullet"/>
+      <w:lvlText w:val=""/>
+      <w:lvlJc w:val="left"/>
+      <w:pPr>
+        <w:ind w:left="2160" w:hanging="360"/>
+      </w:pPr>
+      <w:rPr>
+        <w:rFonts w:ascii="Wingdings" w:hAnsi="Wingdings" w:hint="default"/>
+      </w:rPr>
+    </w:lvl>
+    <w:lvl w:ilvl="3" w:tplc="08090001" w:tentative="1">
+      <w:start w:val="1"/>
+      <w:numFmt w:val="bullet"/>
+      <w:lvlText w:val=""/>
+      <w:lvlJc w:val="left"/>
+      <w:pPr>
+        <w:ind w:left="2880" w:hanging="360"/>
+      </w:pPr>
+      <w:rPr>
+        <w:rFonts w:ascii="Symbol" w:hAnsi="Symbol" w:hint="default"/>
+      </w:rPr>
+    </w:lvl>
+    <w:lvl w:ilvl="4" w:tplc="08090003" w:tentative="1">
+      <w:start w:val="1"/>
+      <w:numFmt w:val="bullet"/>
+      <w:lvlText w:val="o"/>
+      <w:lvlJc w:val="left"/>
+      <w:pPr>
+        <w:ind w:left="3600" w:hanging="360"/>
+      </w:pPr>
+      <w:rPr>
+        <w:rFonts w:ascii="Courier New" w:hAnsi="Courier New" w:cs="Courier New" w:hint="default"/>
+      </w:rPr>
+    </w:lvl>
+    <w:lvl w:ilvl="5" w:tplc="08090005" w:tentative="1">
+      <w:start w:val="1"/>
+      <w:numFmt w:val="bullet"/>
+      <w:lvlText w:val=""/>
+      <w:lvlJc w:val="left"/>
+      <w:pPr>
+        <w:ind w:left="4320" w:hanging="360"/>
+      </w:pPr>
+      <w:rPr>
+        <w:rFonts w:ascii="Wingdings" w:hAnsi="Wingdings" w:hint="default"/>
+      </w:rPr>
+    </w:lvl>
+    <w:lvl w:ilvl="6" w:tplc="08090001" w:tentative="1">
+      <w:start w:val="1"/>
+      <w:numFmt w:val="bullet"/>
+      <w:lvlText w:val=""/>
+      <w:lvlJc w:val="left"/>
+      <w:pPr>
+        <w:ind w:left="5040" w:hanging="360"/>
+      </w:pPr>
+      <w:rPr>
+        <w:rFonts w:ascii="Symbol" w:hAnsi="Symbol" w:hint="default"/>
+      </w:rPr>
+    </w:lvl>
+    <w:lvl w:ilvl="7" w:tplc="08090003" w:tentative="1">
+      <w:start w:val="1"/>
+      <w:numFmt w:val="bullet"/>
+      <w:lvlText w:val="o"/>
+      <w:lvlJc w:val="left"/>
+      <w:pPr>
+        <w:ind w:left="5760" w:hanging="360"/>
+      </w:pPr>
+      <w:rPr>
+        <w:rFonts w:ascii="Courier New" w:hAnsi="Courier New" w:cs="Courier New" w:hint="default"/>
+      </w:rPr>
+    </w:lvl>
+    <w:lvl w:ilvl="8" w:tplc="08090005" w:tentative="1">
+      <w:start w:val="1"/>
+      <w:numFmt w:val="bullet"/>
+      <w:lvlText w:val=""/>
+      <w:lvlJc w:val="left"/>
+      <w:pPr>
+        <w:ind w:left="6480" w:hanging="360"/>
+      </w:pPr>
+      <w:rPr>
+        <w:rFonts w:ascii="Wingdings" w:hAnsi="Wingdings" w:hint="default"/>
+      </w:rPr>
+    </w:lvl>
+  </w:abstractNum>
+  <w:abstractNum w:abstractNumId="1" w15:restartNumberingAfterBreak="0">
+    <w:nsid w:val="0BA60039"/>
+    <w:multiLevelType w:val="hybridMultilevel"/>
+    <w:tmpl w:val="85384AF0"/>
+    <w:lvl w:ilvl="0" w:tplc="08090001">
+      <w:start w:val="1"/>
+      <w:numFmt w:val="bullet"/>
+      <w:lvlText w:val=""/>
+      <w:lvlJc w:val="left"/>
+      <w:pPr>
+        <w:ind w:left="720" w:hanging="360"/>
+      </w:pPr>
+      <w:rPr>
+        <w:rFonts w:ascii="Symbol" w:hAnsi="Symbol" w:hint="default"/>
+      </w:rPr>
+    </w:lvl>
+    <w:lvl w:ilvl="1" w:tplc="08090003" w:tentative="1">
+      <w:start w:val="1"/>
+      <w:numFmt w:val="bullet"/>
+      <w:lvlText w:val="o"/>
+      <w:lvlJc w:val="left"/>
+      <w:pPr>
+        <w:ind w:left="1440" w:hanging="360"/>
+      </w:pPr>
+      <w:rPr>
+        <w:rFonts w:ascii="Courier New" w:hAnsi="Courier New" w:cs="Courier New" w:hint="default"/>
+      </w:rPr>
+    </w:lvl>
+    <w:lvl w:ilvl="2" w:tplc="08090005" w:tentative="1">
+      <w:start w:val="1"/>
+      <w:numFmt w:val="bullet"/>
+      <w:lvlText w:val=""/>
+      <w:lvlJc w:val="left"/>
+      <w:pPr>
+        <w:ind w:left="2160" w:hanging="360"/>
+      </w:pPr>
+      <w:rPr>
+        <w:rFonts w:ascii="Wingdings" w:hAnsi="Wingdings" w:hint="default"/>
+      </w:rPr>
+    </w:lvl>
+    <w:lvl w:ilvl="3" w:tplc="08090001" w:tentative="1">
+      <w:start w:val="1"/>
+      <w:numFmt w:val="bullet"/>
+      <w:lvlText w:val=""/>
+      <w:lvlJc w:val="left"/>
+      <w:pPr>
+        <w:ind w:left="2880" w:hanging="360"/>
+      </w:pPr>
+      <w:rPr>
+        <w:rFonts w:ascii="Symbol" w:hAnsi="Symbol" w:hint="default"/>
+      </w:rPr>
+    </w:lvl>
+    <w:lvl w:ilvl="4" w:tplc="08090003" w:tentative="1">
+      <w:start w:val="1"/>
+      <w:numFmt w:val="bullet"/>
+      <w:lvlText w:val="o"/>
+      <w:lvlJc w:val="left"/>
+      <w:pPr>
+        <w:ind w:left="3600" w:hanging="360"/>
+      </w:pPr>
+      <w:rPr>
+        <w:rFonts w:ascii="Courier New" w:hAnsi="Courier New" w:cs="Courier New" w:hint="default"/>
+      </w:rPr>
+    </w:lvl>
+    <w:lvl w:ilvl="5" w:tplc="08090005" w:tentative="1">
+      <w:start w:val="1"/>
+      <w:numFmt w:val="bullet"/>
+      <w:lvlText w:val=""/>
+      <w:lvlJc w:val="left"/>
+      <w:pPr>
+        <w:ind w:left="4320" w:hanging="360"/>
+      </w:pPr>
+      <w:rPr>
+        <w:rFonts w:ascii="Wingdings" w:hAnsi="Wingdings" w:hint="default"/>
+      </w:rPr>
+    </w:lvl>
+    <w:lvl w:ilvl="6" w:tplc="08090001" w:tentative="1">
+      <w:start w:val="1"/>
+      <w:numFmt w:val="bullet"/>
+      <w:lvlText w:val=""/>
+      <w:lvlJc w:val="left"/>
+      <w:pPr>
+        <w:ind w:left="5040" w:hanging="360"/>
+      </w:pPr>
+      <w:rPr>
+        <w:rFonts w:ascii="Symbol" w:hAnsi="Symbol" w:hint="default"/>
+      </w:rPr>
+    </w:lvl>
+    <w:lvl w:ilvl="7" w:tplc="08090003" w:tentative="1">
+      <w:start w:val="1"/>
+      <w:numFmt w:val="bullet"/>
+      <w:lvlText w:val="o"/>
+      <w:lvlJc w:val="left"/>
+      <w:pPr>
+        <w:ind w:left="5760" w:hanging="360"/>
+      </w:pPr>
+      <w:rPr>
+        <w:rFonts w:ascii="Courier New" w:hAnsi="Courier New" w:cs="Courier New" w:hint="default"/>
+      </w:rPr>
+    </w:lvl>
+    <w:lvl w:ilvl="8" w:tplc="08090005" w:tentative="1">
+      <w:start w:val="1"/>
+      <w:numFmt w:val="bullet"/>
+      <w:lvlText w:val=""/>
+      <w:lvlJc w:val="left"/>
+      <w:pPr>
+        <w:ind w:left="6480" w:hanging="360"/>
+      </w:pPr>
+      <w:rPr>
+        <w:rFonts w:ascii="Wingdings" w:hAnsi="Wingdings" w:hint="default"/>
+      </w:rPr>
+    </w:lvl>
+  </w:abstractNum>
+  <w:abstractNum w:abstractNumId="2" w15:restartNumberingAfterBreak="0">
+    <w:nsid w:val="2A7A4F68"/>
+    <w:multiLevelType w:val="hybridMultilevel"/>
+    <w:tmpl w:val="0B2E4C2C"/>
+    <w:lvl w:ilvl="0" w:tplc="08090001">
+      <w:start w:val="1"/>
+      <w:numFmt w:val="bullet"/>
+      <w:lvlText w:val=""/>
+      <w:lvlJc w:val="left"/>
+      <w:pPr>
+        <w:ind w:left="720" w:hanging="360"/>
+      </w:pPr>
+      <w:rPr>
+        <w:rFonts w:ascii="Symbol" w:hAnsi="Symbol" w:hint="default"/>
+      </w:rPr>
+    </w:lvl>
+    <w:lvl w:ilvl="1" w:tplc="08090003">
+      <w:start w:val="1"/>
+      <w:numFmt w:val="bullet"/>
+      <w:lvlText w:val="o"/>
+      <w:lvlJc w:val="left"/>
+      <w:pPr>
+        <w:ind w:left="1440" w:hanging="360"/>
+      </w:pPr>
+      <w:rPr>
+        <w:rFonts w:ascii="Courier New" w:hAnsi="Courier New" w:cs="Courier New" w:hint="default"/>
+      </w:rPr>
+    </w:lvl>
+    <w:lvl w:ilvl="2" w:tplc="08090005" w:tentative="1">
+      <w:start w:val="1"/>
+      <w:numFmt w:val="bullet"/>
+      <w:lvlText w:val=""/>
+      <w:lvlJc w:val="left"/>
+      <w:pPr>
+        <w:ind w:left="2160" w:hanging="360"/>
+      </w:pPr>
+      <w:rPr>
+        <w:rFonts w:ascii="Wingdings" w:hAnsi="Wingdings" w:hint="default"/>
+      </w:rPr>
+    </w:lvl>
+    <w:lvl w:ilvl="3" w:tplc="08090001" w:tentative="1">
+      <w:start w:val="1"/>
+      <w:numFmt w:val="bullet"/>
+      <w:lvlText w:val=""/>
+      <w:lvlJc w:val="left"/>
+      <w:pPr>
+        <w:ind w:left="2880" w:hanging="360"/>
+      </w:pPr>
+      <w:rPr>
+        <w:rFonts w:ascii="Symbol" w:hAnsi="Symbol" w:hint="default"/>
+      </w:rPr>
+    </w:lvl>
+    <w:lvl w:ilvl="4" w:tplc="08090003" w:tentative="1">
+      <w:start w:val="1"/>
+      <w:numFmt w:val="bullet"/>
+      <w:lvlText w:val="o"/>
+      <w:lvlJc w:val="left"/>
+      <w:pPr>
+        <w:ind w:left="3600" w:hanging="360"/>
+      </w:pPr>
+      <w:rPr>
+        <w:rFonts w:ascii="Courier New" w:hAnsi="Courier New" w:cs="Courier New" w:hint="default"/>
+      </w:rPr>
+    </w:lvl>
+    <w:lvl w:ilvl="5" w:tplc="08090005" w:tentative="1">
+      <w:start w:val="1"/>
+      <w:numFmt w:val="bullet"/>
+      <w:lvlText w:val=""/>
+      <w:lvlJc w:val="left"/>
+      <w:pPr>
+        <w:ind w:left="4320" w:hanging="360"/>
+      </w:pPr>
+      <w:rPr>
+        <w:rFonts w:ascii="Wingdings" w:hAnsi="Wingdings" w:hint="default"/>
+      </w:rPr>
+    </w:lvl>
+    <w:lvl w:ilvl="6" w:tplc="08090001" w:tentative="1">
+      <w:start w:val="1"/>
+      <w:numFmt w:val="bullet"/>
+      <w:lvlText w:val=""/>
+      <w:lvlJc w:val="left"/>
+      <w:pPr>
+        <w:ind w:left="5040" w:hanging="360"/>
+      </w:pPr>
+      <w:rPr>
+        <w:rFonts w:ascii="Symbol" w:hAnsi="Symbol" w:hint="default"/>
+      </w:rPr>
+    </w:lvl>
+    <w:lvl w:ilvl="7" w:tplc="08090003" w:tentative="1">
+      <w:start w:val="1"/>
+      <w:numFmt w:val="bullet"/>
+      <w:lvlText w:val="o"/>
+      <w:lvlJc w:val="left"/>
+      <w:pPr>
+        <w:ind w:left="5760" w:hanging="360"/>
+      </w:pPr>
+      <w:rPr>
+        <w:rFonts w:ascii="Courier New" w:hAnsi="Courier New" w:cs="Courier New" w:hint="default"/>
+      </w:rPr>
+    </w:lvl>
+    <w:lvl w:ilvl="8" w:tplc="08090005" w:tentative="1">
+      <w:start w:val="1"/>
+      <w:numFmt w:val="bullet"/>
+      <w:lvlText w:val=""/>
+      <w:lvlJc w:val="left"/>
+      <w:pPr>
+        <w:ind w:left="6480" w:hanging="360"/>
+      </w:pPr>
+      <w:rPr>
+        <w:rFonts w:ascii="Wingdings" w:hAnsi="Wingdings" w:hint="default"/>
+      </w:rPr>
+    </w:lvl>
+  </w:abstractNum>
+  <w:abstractNum w:abstractNumId="3" w15:restartNumberingAfterBreak="0">
+    <w:nsid w:val="2DF54092"/>
+    <w:multiLevelType w:val="hybridMultilevel"/>
+    <w:tmpl w:val="904C3DEC"/>
+    <w:lvl w:ilvl="0" w:tplc="08090003">
+      <w:start w:val="1"/>
+      <w:numFmt w:val="bullet"/>
+      <w:lvlText w:val="o"/>
+      <w:lvlJc w:val="left"/>
+      <w:pPr>
+        <w:ind w:left="720" w:hanging="360"/>
+      </w:pPr>
+      <w:rPr>
+        <w:rFonts w:ascii="Courier New" w:hAnsi="Courier New" w:cs="Courier New" w:hint="default"/>
+      </w:rPr>
+    </w:lvl>
+    <w:lvl w:ilvl="1" w:tplc="08090003" w:tentative="1">
+      <w:start w:val="1"/>
+      <w:numFmt w:val="bullet"/>
+      <w:lvlText w:val="o"/>
+      <w:lvlJc w:val="left"/>
+      <w:pPr>
+        <w:ind w:left="1440" w:hanging="360"/>
+      </w:pPr>
+      <w:rPr>
+        <w:rFonts w:ascii="Courier New" w:hAnsi="Courier New" w:cs="Courier New" w:hint="default"/>
+      </w:rPr>
+    </w:lvl>
+    <w:lvl w:ilvl="2" w:tplc="08090005" w:tentative="1">
+      <w:start w:val="1"/>
+      <w:numFmt w:val="bullet"/>
+      <w:lvlText w:val=""/>
+      <w:lvlJc w:val="left"/>
+      <w:pPr>
+        <w:ind w:left="2160" w:hanging="360"/>
+      </w:pPr>
+      <w:rPr>
+        <w:rFonts w:ascii="Wingdings" w:hAnsi="Wingdings" w:hint="default"/>
+      </w:rPr>
+    </w:lvl>
+    <w:lvl w:ilvl="3" w:tplc="08090001" w:tentative="1">
+      <w:start w:val="1"/>
+      <w:numFmt w:val="bullet"/>
+      <w:lvlText w:val=""/>
+      <w:lvlJc w:val="left"/>
+      <w:pPr>
+        <w:ind w:left="2880" w:hanging="360"/>
+      </w:pPr>
+      <w:rPr>
+        <w:rFonts w:ascii="Symbol" w:hAnsi="Symbol" w:hint="default"/>
+      </w:rPr>
+    </w:lvl>
+    <w:lvl w:ilvl="4" w:tplc="08090003" w:tentative="1">
+      <w:start w:val="1"/>
+      <w:numFmt w:val="bullet"/>
+      <w:lvlText w:val="o"/>
+      <w:lvlJc w:val="left"/>
+      <w:pPr>
+        <w:ind w:left="3600" w:hanging="360"/>
+      </w:pPr>
+      <w:rPr>
+        <w:rFonts w:ascii="Courier New" w:hAnsi="Courier New" w:cs="Courier New" w:hint="default"/>
+      </w:rPr>
+    </w:lvl>
+    <w:lvl w:ilvl="5" w:tplc="08090005" w:tentative="1">
+      <w:start w:val="1"/>
+      <w:numFmt w:val="bullet"/>
+      <w:lvlText w:val=""/>
+      <w:lvlJc w:val="left"/>
+      <w:pPr>
+        <w:ind w:left="4320" w:hanging="360"/>
+      </w:pPr>
+      <w:rPr>
+        <w:rFonts w:ascii="Wingdings" w:hAnsi="Wingdings" w:hint="default"/>
+      </w:rPr>
+    </w:lvl>
+    <w:lvl w:ilvl="6" w:tplc="08090001" w:tentative="1">
+      <w:start w:val="1"/>
+      <w:numFmt w:val="bullet"/>
+      <w:lvlText w:val=""/>
+      <w:lvlJc w:val="left"/>
+      <w:pPr>
+        <w:ind w:left="5040" w:hanging="360"/>
+      </w:pPr>
+      <w:rPr>
+        <w:rFonts w:ascii="Symbol" w:hAnsi="Symbol" w:hint="default"/>
+      </w:rPr>
+    </w:lvl>
+    <w:lvl w:ilvl="7" w:tplc="08090003" w:tentative="1">
+      <w:start w:val="1"/>
+      <w:numFmt w:val="bullet"/>
+      <w:lvlText w:val="o"/>
+      <w:lvlJc w:val="left"/>
+      <w:pPr>
+        <w:ind w:left="5760" w:hanging="360"/>
+      </w:pPr>
+      <w:rPr>
+        <w:rFonts w:ascii="Courier New" w:hAnsi="Courier New" w:cs="Courier New" w:hint="default"/>
+      </w:rPr>
+    </w:lvl>
+    <w:lvl w:ilvl="8" w:tplc="08090005" w:tentative="1">
+      <w:start w:val="1"/>
+      <w:numFmt w:val="bullet"/>
+      <w:lvlText w:val=""/>
+      <w:lvlJc w:val="left"/>
+      <w:pPr>
+        <w:ind w:left="6480" w:hanging="360"/>
+      </w:pPr>
+      <w:rPr>
+        <w:rFonts w:ascii="Wingdings" w:hAnsi="Wingdings" w:hint="default"/>
+      </w:rPr>
+    </w:lvl>
+  </w:abstractNum>
+  <w:abstractNum w:abstractNumId="4" w15:restartNumberingAfterBreak="0">
+    <w:nsid w:val="46F32C95"/>
+    <w:multiLevelType w:val="multilevel"/>
+    <w:tmpl w:val="16B45AE6"/>
+    <w:lvl w:ilvl="0">
+      <w:start w:val="1"/>
+      <w:numFmt w:val="bullet"/>
+      <w:lvlText w:val=""/>
+      <w:lvlJc w:val="left"/>
+      <w:pPr>
+        <w:tabs>
+          <w:tab w:val="num" w:pos="720"/>
+        </w:tabs>
+        <w:ind w:left="720" w:hanging="360"/>
+      </w:pPr>
+      <w:rPr>
+        <w:rFonts w:ascii="Symbol" w:hAnsi="Symbol" w:hint="default"/>
+        <w:sz w:val="20"/>
+      </w:rPr>
+    </w:lvl>
+    <w:lvl w:ilvl="1" w:tentative="1">
+      <w:start w:val="1"/>
+      <w:numFmt w:val="bullet"/>
+      <w:lvlText w:val="o"/>
+      <w:lvlJc w:val="left"/>
+      <w:pPr>
+        <w:tabs>
+          <w:tab w:val="num" w:pos="1440"/>
+        </w:tabs>
+        <w:ind w:left="1440" w:hanging="360"/>
+      </w:pPr>
+      <w:rPr>
+        <w:rFonts w:ascii="Courier New" w:hAnsi="Courier New" w:hint="default"/>
+        <w:sz w:val="20"/>
+      </w:rPr>
+    </w:lvl>
+    <w:lvl w:ilvl="2" w:tentative="1">
+      <w:start w:val="1"/>
+      <w:numFmt w:val="bullet"/>
+      <w:lvlText w:val=""/>
+      <w:lvlJc w:val="left"/>
+      <w:pPr>
+        <w:tabs>
+          <w:tab w:val="num" w:pos="2160"/>
+        </w:tabs>
+        <w:ind w:left="2160" w:hanging="360"/>
+      </w:pPr>
+      <w:rPr>
+        <w:rFonts w:ascii="Wingdings" w:hAnsi="Wingdings" w:hint="default"/>
+        <w:sz w:val="20"/>
+      </w:rPr>
+    </w:lvl>
+    <w:lvl w:ilvl="3" w:tentative="1">
+      <w:start w:val="1"/>
+      <w:numFmt w:val="bullet"/>
+      <w:lvlText w:val=""/>
+      <w:lvlJc w:val="left"/>
+      <w:pPr>
+        <w:tabs>
+          <w:tab w:val="num" w:pos="2880"/>
+        </w:tabs>
+        <w:ind w:left="2880" w:hanging="360"/>
+      </w:pPr>
+      <w:rPr>
+        <w:rFonts w:ascii="Wingdings" w:hAnsi="Wingdings" w:hint="default"/>
+        <w:sz w:val="20"/>
+      </w:rPr>
+    </w:lvl>
+    <w:lvl w:ilvl="4" w:tentative="1">
+      <w:start w:val="1"/>
+      <w:numFmt w:val="bullet"/>
+      <w:lvlText w:val=""/>
+      <w:lvlJc w:val="left"/>
+      <w:pPr>
+        <w:tabs>
+          <w:tab w:val="num" w:pos="3600"/>
+        </w:tabs>
+        <w:ind w:left="3600" w:hanging="360"/>
+      </w:pPr>
+      <w:rPr>
+        <w:rFonts w:ascii="Wingdings" w:hAnsi="Wingdings" w:hint="default"/>
+        <w:sz w:val="20"/>
+      </w:rPr>
+    </w:lvl>
+    <w:lvl w:ilvl="5" w:tentative="1">
+      <w:start w:val="1"/>
+      <w:numFmt w:val="bullet"/>
+      <w:lvlText w:val=""/>
+      <w:lvlJc w:val="left"/>
+      <w:pPr>
+        <w:tabs>
+          <w:tab w:val="num" w:pos="4320"/>
+        </w:tabs>
+        <w:ind w:left="4320" w:hanging="360"/>
+      </w:pPr>
+      <w:rPr>
+        <w:rFonts w:ascii="Wingdings" w:hAnsi="Wingdings" w:hint="default"/>
+        <w:sz w:val="20"/>
+      </w:rPr>
+    </w:lvl>
+    <w:lvl w:ilvl="6" w:tentative="1">
+      <w:start w:val="1"/>
+      <w:numFmt w:val="bullet"/>
+      <w:lvlText w:val=""/>
+      <w:lvlJc w:val="left"/>
+      <w:pPr>
+        <w:tabs>
+          <w:tab w:val="num" w:pos="5040"/>
+        </w:tabs>
+        <w:ind w:left="5040" w:hanging="360"/>
+      </w:pPr>
+      <w:rPr>
+        <w:rFonts w:ascii="Wingdings" w:hAnsi="Wingdings" w:hint="default"/>
+        <w:sz w:val="20"/>
+      </w:rPr>
+    </w:lvl>
+    <w:lvl w:ilvl="7" w:tentative="1">
+      <w:start w:val="1"/>
+      <w:numFmt w:val="bullet"/>
+      <w:lvlText w:val=""/>
+      <w:lvlJc w:val="left"/>
+      <w:pPr>
+        <w:tabs>
+          <w:tab w:val="num" w:pos="5760"/>
+        </w:tabs>
+        <w:ind w:left="5760" w:hanging="360"/>
+      </w:pPr>
+      <w:rPr>
+        <w:rFonts w:ascii="Wingdings" w:hAnsi="Wingdings" w:hint="default"/>
+        <w:sz w:val="20"/>
+      </w:rPr>
+    </w:lvl>
+    <w:lvl w:ilvl="8" w:tentative="1">
+      <w:start w:val="1"/>
+      <w:numFmt w:val="bullet"/>
+      <w:lvlText w:val=""/>
+      <w:lvlJc w:val="left"/>
+      <w:pPr>
+        <w:tabs>
+          <w:tab w:val="num" w:pos="6480"/>
+        </w:tabs>
+        <w:ind w:left="6480" w:hanging="360"/>
+      </w:pPr>
+      <w:rPr>
+        <w:rFonts w:ascii="Wingdings" w:hAnsi="Wingdings" w:hint="default"/>
+        <w:sz w:val="20"/>
+      </w:rPr>
+    </w:lvl>
+  </w:abstractNum>
+  <w:abstractNum w:abstractNumId="5" w15:restartNumberingAfterBreak="0">
     <w:nsid w:val="4D4F1353"/>
     <w:multiLevelType w:val="hybridMultilevel"/>
     <w:tmpl w:val="07C465A8"/>
@@ -789,10 +1960,123 @@
       </w:rPr>
     </w:lvl>
   </w:abstractNum>
-  <w:abstractNum w:abstractNumId="1" w15:restartNumberingAfterBreak="0">
+  <w:abstractNum w:abstractNumId="6" w15:restartNumberingAfterBreak="0">
+    <w:nsid w:val="5AC20E87"/>
+    <w:multiLevelType w:val="hybridMultilevel"/>
+    <w:tmpl w:val="080C0620"/>
+    <w:lvl w:ilvl="0" w:tplc="08090001">
+      <w:start w:val="1"/>
+      <w:numFmt w:val="bullet"/>
+      <w:lvlText w:val=""/>
+      <w:lvlJc w:val="left"/>
+      <w:pPr>
+        <w:ind w:left="720" w:hanging="360"/>
+      </w:pPr>
+      <w:rPr>
+        <w:rFonts w:ascii="Symbol" w:hAnsi="Symbol" w:hint="default"/>
+      </w:rPr>
+    </w:lvl>
+    <w:lvl w:ilvl="1" w:tplc="08090003" w:tentative="1">
+      <w:start w:val="1"/>
+      <w:numFmt w:val="bullet"/>
+      <w:lvlText w:val="o"/>
+      <w:lvlJc w:val="left"/>
+      <w:pPr>
+        <w:ind w:left="1440" w:hanging="360"/>
+      </w:pPr>
+      <w:rPr>
+        <w:rFonts w:ascii="Courier New" w:hAnsi="Courier New" w:cs="Courier New" w:hint="default"/>
+      </w:rPr>
+    </w:lvl>
+    <w:lvl w:ilvl="2" w:tplc="08090005" w:tentative="1">
+      <w:start w:val="1"/>
+      <w:numFmt w:val="bullet"/>
+      <w:lvlText w:val=""/>
+      <w:lvlJc w:val="left"/>
+      <w:pPr>
+        <w:ind w:left="2160" w:hanging="360"/>
+      </w:pPr>
+      <w:rPr>
+        <w:rFonts w:ascii="Wingdings" w:hAnsi="Wingdings" w:hint="default"/>
+      </w:rPr>
+    </w:lvl>
+    <w:lvl w:ilvl="3" w:tplc="08090001" w:tentative="1">
+      <w:start w:val="1"/>
+      <w:numFmt w:val="bullet"/>
+      <w:lvlText w:val=""/>
+      <w:lvlJc w:val="left"/>
+      <w:pPr>
+        <w:ind w:left="2880" w:hanging="360"/>
+      </w:pPr>
+      <w:rPr>
+        <w:rFonts w:ascii="Symbol" w:hAnsi="Symbol" w:hint="default"/>
+      </w:rPr>
+    </w:lvl>
+    <w:lvl w:ilvl="4" w:tplc="08090003" w:tentative="1">
+      <w:start w:val="1"/>
+      <w:numFmt w:val="bullet"/>
+      <w:lvlText w:val="o"/>
+      <w:lvlJc w:val="left"/>
+      <w:pPr>
+        <w:ind w:left="3600" w:hanging="360"/>
+      </w:pPr>
+      <w:rPr>
+        <w:rFonts w:ascii="Courier New" w:hAnsi="Courier New" w:cs="Courier New" w:hint="default"/>
+      </w:rPr>
+    </w:lvl>
+    <w:lvl w:ilvl="5" w:tplc="08090005" w:tentative="1">
+      <w:start w:val="1"/>
+      <w:numFmt w:val="bullet"/>
+      <w:lvlText w:val=""/>
+      <w:lvlJc w:val="left"/>
+      <w:pPr>
+        <w:ind w:left="4320" w:hanging="360"/>
+      </w:pPr>
+      <w:rPr>
+        <w:rFonts w:ascii="Wingdings" w:hAnsi="Wingdings" w:hint="default"/>
+      </w:rPr>
+    </w:lvl>
+    <w:lvl w:ilvl="6" w:tplc="08090001" w:tentative="1">
+      <w:start w:val="1"/>
+      <w:numFmt w:val="bullet"/>
+      <w:lvlText w:val=""/>
+      <w:lvlJc w:val="left"/>
+      <w:pPr>
+        <w:ind w:left="5040" w:hanging="360"/>
+      </w:pPr>
+      <w:rPr>
+        <w:rFonts w:ascii="Symbol" w:hAnsi="Symbol" w:hint="default"/>
+      </w:rPr>
+    </w:lvl>
+    <w:lvl w:ilvl="7" w:tplc="08090003" w:tentative="1">
+      <w:start w:val="1"/>
+      <w:numFmt w:val="bullet"/>
+      <w:lvlText w:val="o"/>
+      <w:lvlJc w:val="left"/>
+      <w:pPr>
+        <w:ind w:left="5760" w:hanging="360"/>
+      </w:pPr>
+      <w:rPr>
+        <w:rFonts w:ascii="Courier New" w:hAnsi="Courier New" w:cs="Courier New" w:hint="default"/>
+      </w:rPr>
+    </w:lvl>
+    <w:lvl w:ilvl="8" w:tplc="08090005" w:tentative="1">
+      <w:start w:val="1"/>
+      <w:numFmt w:val="bullet"/>
+      <w:lvlText w:val=""/>
+      <w:lvlJc w:val="left"/>
+      <w:pPr>
+        <w:ind w:left="6480" w:hanging="360"/>
+      </w:pPr>
+      <w:rPr>
+        <w:rFonts w:ascii="Wingdings" w:hAnsi="Wingdings" w:hint="default"/>
+      </w:rPr>
+    </w:lvl>
+  </w:abstractNum>
+  <w:abstractNum w:abstractNumId="7" w15:restartNumberingAfterBreak="0">
     <w:nsid w:val="7D737D6E"/>
     <w:multiLevelType w:val="hybridMultilevel"/>
-    <w:tmpl w:val="61D46CBA"/>
+    <w:tmpl w:val="B0D21B7A"/>
     <w:lvl w:ilvl="0" w:tplc="08090001">
       <w:start w:val="1"/>
       <w:numFmt w:val="bullet"/>
@@ -805,7 +2089,7 @@
         <w:rFonts w:ascii="Symbol" w:hAnsi="Symbol" w:hint="default"/>
       </w:rPr>
     </w:lvl>
-    <w:lvl w:ilvl="1" w:tplc="08090003" w:tentative="1">
+    <w:lvl w:ilvl="1" w:tplc="08090003">
       <w:start w:val="1"/>
       <w:numFmt w:val="bullet"/>
       <w:lvlText w:val="o"/>
@@ -817,7 +2101,7 @@
         <w:rFonts w:ascii="Courier New" w:hAnsi="Courier New" w:cs="Courier New" w:hint="default"/>
       </w:rPr>
     </w:lvl>
-    <w:lvl w:ilvl="2" w:tplc="08090005" w:tentative="1">
+    <w:lvl w:ilvl="2" w:tplc="08090005">
       <w:start w:val="1"/>
       <w:numFmt w:val="bullet"/>
       <w:lvlText w:val=""/>
@@ -903,10 +2187,28 @@
     </w:lvl>
   </w:abstractNum>
   <w:num w:numId="1" w16cid:durableId="281305179">
+    <w:abstractNumId w:val="5"/>
+  </w:num>
+  <w:num w:numId="2" w16cid:durableId="592795">
+    <w:abstractNumId w:val="7"/>
+  </w:num>
+  <w:num w:numId="3" w16cid:durableId="1313365266">
+    <w:abstractNumId w:val="4"/>
+  </w:num>
+  <w:num w:numId="4" w16cid:durableId="1580403973">
+    <w:abstractNumId w:val="2"/>
+  </w:num>
+  <w:num w:numId="5" w16cid:durableId="533471023">
+    <w:abstractNumId w:val="1"/>
+  </w:num>
+  <w:num w:numId="6" w16cid:durableId="270011522">
     <w:abstractNumId w:val="0"/>
   </w:num>
-  <w:num w:numId="2" w16cid:durableId="592795">
-    <w:abstractNumId w:val="1"/>
+  <w:num w:numId="7" w16cid:durableId="1154030611">
+    <w:abstractNumId w:val="3"/>
+  </w:num>
+  <w:num w:numId="8" w16cid:durableId="1383479091">
+    <w:abstractNumId w:val="6"/>
   </w:num>
 </w:numbering>
 </file>
@@ -1903,6 +3205,28 @@
     <w:unhideWhenUsed/>
     <w:rsid w:val="00AB6F62"/>
   </w:style>
+  <w:style w:type="paragraph" w:styleId="NormalWeb">
+    <w:name w:val="Normal (Web)"/>
+    <w:basedOn w:val="Normal"/>
+    <w:uiPriority w:val="99"/>
+    <w:semiHidden/>
+    <w:unhideWhenUsed/>
+    <w:rsid w:val="000B7F44"/>
+    <w:pPr>
+      <w:spacing w:before="100" w:beforeAutospacing="1" w:after="100" w:afterAutospacing="1" w:line="240" w:lineRule="auto"/>
+    </w:pPr>
+    <w:rPr>
+      <w:rFonts w:ascii="Times New Roman" w:eastAsia="Times New Roman" w:hAnsi="Times New Roman" w:cs="Times New Roman"/>
+      <w:kern w:val="0"/>
+      <w:lang w:eastAsia="en-GB"/>
+      <w14:ligatures w14:val="none"/>
+    </w:rPr>
+  </w:style>
+  <w:style w:type="character" w:customStyle="1" w:styleId="apple-converted-space">
+    <w:name w:val="apple-converted-space"/>
+    <w:basedOn w:val="DefaultParagraphFont"/>
+    <w:rsid w:val="000B7F44"/>
+  </w:style>
 </w:styles>
 </file>
 

</xml_diff>